<commit_message>
feat: refactor account management forms to include first name, last name, and email fields
</commit_message>
<xml_diff>
--- a/vault-configuration.docx
+++ b/vault-configuration.docx
@@ -83,36 +83,400 @@
     </w:p>
     <w:p>
       <w:pPr>
-        <w:pStyle w:val="Normal"/>
-        <w:bidi w:val="0"/>
-        <w:jc w:val="start"/>
-        <w:rPr/>
-      </w:pPr>
-      <w:r>
-        <w:rPr/>
-      </w:r>
-    </w:p>
-    <w:p>
-      <w:pPr>
-        <w:pStyle w:val="Normal"/>
-        <w:bidi w:val="0"/>
-        <w:jc w:val="start"/>
-        <w:rPr/>
-      </w:pPr>
-      <w:r>
-        <w:rPr/>
-      </w:r>
-    </w:p>
-    <w:p>
-      <w:pPr>
-        <w:pStyle w:val="Normal"/>
-        <w:bidi w:val="0"/>
-        <w:jc w:val="start"/>
-        <w:rPr/>
-      </w:pPr>
-      <w:r>
-        <w:rPr/>
-      </w:r>
+        <w:pStyle w:val="PreformattedText"/>
+        <w:shd w:val="clear" w:fill="E1E1E1"/>
+        <w:spacing w:before="0" w:after="283"/>
+        <w:rPr>
+          <w:b/>
+          <w:bCs/>
+          <w:color w:val="C9211E"/>
+        </w:rPr>
+      </w:pPr>
+      <w:r>
+        <w:rPr>
+          <w:b/>
+          <w:bCs/>
+          <w:color w:val="C9211E"/>
+        </w:rPr>
+        <w:t>docker compose -f docker-compose-vault.yml exec vault \</w:t>
+        <w:br/>
+        <w:t xml:space="preserve">  vault operator init -key-shares=</w:t>
+      </w:r>
+      <w:r>
+        <w:rPr>
+          <w:b/>
+          <w:bCs/>
+          <w:color w:val="C9211E"/>
+        </w:rPr>
+        <w:t>1</w:t>
+      </w:r>
+      <w:r>
+        <w:rPr>
+          <w:b/>
+          <w:bCs/>
+          <w:color w:val="C9211E"/>
+        </w:rPr>
+        <w:t xml:space="preserve"> -key-threshold=</w:t>
+      </w:r>
+      <w:r>
+        <w:rPr>
+          <w:b/>
+          <w:bCs/>
+          <w:color w:val="C9211E"/>
+        </w:rPr>
+        <w:t>1</w:t>
+      </w:r>
+    </w:p>
+    <w:p>
+      <w:pPr>
+        <w:pStyle w:val="PreformattedText"/>
+        <w:shd w:val="clear" w:fill="E1E1E1"/>
+        <w:spacing w:before="0" w:after="283"/>
+        <w:rPr/>
+      </w:pPr>
+      <w:r>
+        <w:rPr/>
+        <w:t>docker exec -it vault vault operator unseal</w:t>
+      </w:r>
+    </w:p>
+    <w:p>
+      <w:pPr>
+        <w:pStyle w:val="Normal"/>
+        <w:bidi w:val="0"/>
+        <w:jc w:val="start"/>
+        <w:rPr/>
+      </w:pPr>
+      <w:r>
+        <w:rPr/>
+      </w:r>
+    </w:p>
+    <w:p>
+      <w:pPr>
+        <w:pStyle w:val="Normal"/>
+        <w:bidi w:val="0"/>
+        <w:jc w:val="start"/>
+        <w:rPr/>
+      </w:pPr>
+      <w:r>
+        <w:rPr/>
+      </w:r>
+    </w:p>
+    <w:p>
+      <w:pPr>
+        <w:sectPr>
+          <w:type w:val="nextPage"/>
+          <w:pgSz w:w="11906" w:h="16838"/>
+          <w:pgMar w:left="1134" w:right="1134" w:gutter="0" w:header="0" w:top="1134" w:footer="0" w:bottom="1134"/>
+          <w:pgNumType w:fmt="decimal"/>
+          <w:formProt w:val="false"/>
+          <w:textDirection w:val="lrTb"/>
+          <w:docGrid w:type="default" w:linePitch="100" w:charSpace="0"/>
+        </w:sectPr>
+      </w:pPr>
+    </w:p>
+    <w:tbl>
+      <w:tblPr>
+        <w:tblW w:w="8772" w:type="dxa"/>
+        <w:jc w:val="start"/>
+        <w:tblInd w:w="0" w:type="dxa"/>
+        <w:tblLayout w:type="fixed"/>
+        <w:tblCellMar>
+          <w:top w:w="0" w:type="dxa"/>
+          <w:start w:w="0" w:type="dxa"/>
+          <w:bottom w:w="0" w:type="dxa"/>
+          <w:end w:w="0" w:type="dxa"/>
+        </w:tblCellMar>
+      </w:tblPr>
+      <w:tblGrid>
+        <w:gridCol w:w="1261"/>
+        <w:gridCol w:w="7511"/>
+      </w:tblGrid>
+      <w:tr>
+        <w:trPr>
+          <w:tblHeader w:val="true"/>
+        </w:trPr>
+        <w:tc>
+          <w:tcPr>
+            <w:tcW w:w="1261" w:type="dxa"/>
+            <w:tcBorders/>
+            <w:vAlign w:val="center"/>
+          </w:tcPr>
+          <w:p>
+            <w:pPr>
+              <w:pStyle w:val="TableContents"/>
+              <w:ind w:hanging="0" w:start="0" w:end="0"/>
+              <w:rPr>
+                <w:sz w:val="4"/>
+                <w:szCs w:val="4"/>
+              </w:rPr>
+            </w:pPr>
+            <w:r>
+              <w:rPr>
+                <w:sz w:val="4"/>
+                <w:szCs w:val="4"/>
+              </w:rPr>
+            </w:r>
+            <w:bookmarkStart w:id="0" w:name="value"/>
+            <w:bookmarkStart w:id="1" w:name="default"/>
+            <w:bookmarkEnd w:id="0"/>
+            <w:bookmarkEnd w:id="1"/>
+          </w:p>
+        </w:tc>
+        <w:tc>
+          <w:tcPr>
+            <w:tcW w:w="7511" w:type="dxa"/>
+            <w:tcBorders/>
+            <w:vAlign w:val="center"/>
+          </w:tcPr>
+          <w:p>
+            <w:pPr>
+              <w:pStyle w:val="TableContents"/>
+              <w:ind w:hanging="0" w:start="0" w:end="0"/>
+              <w:rPr>
+                <w:sz w:val="4"/>
+                <w:szCs w:val="4"/>
+              </w:rPr>
+            </w:pPr>
+            <w:r>
+              <w:rPr>
+                <w:sz w:val="4"/>
+                <w:szCs w:val="4"/>
+              </w:rPr>
+            </w:r>
+            <w:bookmarkStart w:id="2" w:name="%2Fkeys"/>
+            <w:bookmarkEnd w:id="2"/>
+          </w:p>
+        </w:tc>
+      </w:tr>
+      <w:tr>
+        <w:trPr/>
+        <w:tc>
+          <w:tcPr>
+            <w:tcW w:w="1261" w:type="dxa"/>
+            <w:tcBorders/>
+            <w:vAlign w:val="center"/>
+          </w:tcPr>
+          <w:p>
+            <w:pPr>
+              <w:pStyle w:val="TableContents"/>
+              <w:rPr/>
+            </w:pPr>
+            <w:r>
+              <w:rPr/>
+              <w:t>keys</w:t>
+            </w:r>
+          </w:p>
+        </w:tc>
+        <w:tc>
+          <w:tcPr>
+            <w:tcW w:w="7511" w:type="dxa"/>
+            <w:tcBorders/>
+            <w:vAlign w:val="center"/>
+          </w:tcPr>
+          <w:p>
+            <w:pPr>
+              <w:pStyle w:val="TableContents"/>
+              <w:ind w:hanging="0" w:start="0" w:end="0"/>
+              <w:rPr>
+                <w:sz w:val="4"/>
+                <w:szCs w:val="4"/>
+              </w:rPr>
+            </w:pPr>
+            <w:r>
+              <w:rPr>
+                <w:sz w:val="4"/>
+                <w:szCs w:val="4"/>
+              </w:rPr>
+            </w:r>
+            <w:bookmarkStart w:id="3" w:name="%2Fkeys%2F0"/>
+            <w:bookmarkEnd w:id="3"/>
+          </w:p>
+        </w:tc>
+      </w:tr>
+      <w:tr>
+        <w:trPr/>
+        <w:tc>
+          <w:tcPr>
+            <w:tcW w:w="1261" w:type="dxa"/>
+            <w:tcBorders/>
+            <w:vAlign w:val="center"/>
+          </w:tcPr>
+          <w:p>
+            <w:pPr>
+              <w:pStyle w:val="TableContents"/>
+              <w:rPr/>
+            </w:pPr>
+            <w:r>
+              <w:rPr/>
+              <w:t>0</w:t>
+            </w:r>
+          </w:p>
+        </w:tc>
+        <w:tc>
+          <w:tcPr>
+            <w:tcW w:w="7511" w:type="dxa"/>
+            <w:tcBorders/>
+            <w:vAlign w:val="center"/>
+          </w:tcPr>
+          <w:p>
+            <w:pPr>
+              <w:pStyle w:val="TableContents"/>
+              <w:ind w:hanging="0" w:start="0" w:end="0"/>
+              <w:rPr/>
+            </w:pPr>
+            <w:r>
+              <w:rPr/>
+              <w:t>"c7074680a9e5d81ec7377abc8c11af046eaf9f1ec40798e7cfe0301cb299107b"</w:t>
+            </w:r>
+            <w:bookmarkStart w:id="4" w:name="%2Fkeys_base64"/>
+            <w:bookmarkEnd w:id="4"/>
+          </w:p>
+        </w:tc>
+      </w:tr>
+      <w:tr>
+        <w:trPr/>
+        <w:tc>
+          <w:tcPr>
+            <w:tcW w:w="1261" w:type="dxa"/>
+            <w:tcBorders/>
+            <w:vAlign w:val="center"/>
+          </w:tcPr>
+          <w:p>
+            <w:pPr>
+              <w:pStyle w:val="TableContents"/>
+              <w:rPr/>
+            </w:pPr>
+            <w:r>
+              <w:rPr/>
+              <w:t>keys_base64</w:t>
+            </w:r>
+          </w:p>
+        </w:tc>
+        <w:tc>
+          <w:tcPr>
+            <w:tcW w:w="7511" w:type="dxa"/>
+            <w:tcBorders/>
+            <w:vAlign w:val="center"/>
+          </w:tcPr>
+          <w:p>
+            <w:pPr>
+              <w:pStyle w:val="TableContents"/>
+              <w:ind w:hanging="0" w:start="0" w:end="0"/>
+              <w:rPr>
+                <w:sz w:val="4"/>
+                <w:szCs w:val="4"/>
+              </w:rPr>
+            </w:pPr>
+            <w:r>
+              <w:rPr>
+                <w:sz w:val="4"/>
+                <w:szCs w:val="4"/>
+              </w:rPr>
+            </w:r>
+            <w:bookmarkStart w:id="5" w:name="%2Fkeys_base64%2F0"/>
+            <w:bookmarkEnd w:id="5"/>
+          </w:p>
+        </w:tc>
+      </w:tr>
+      <w:tr>
+        <w:trPr/>
+        <w:tc>
+          <w:tcPr>
+            <w:tcW w:w="1261" w:type="dxa"/>
+            <w:tcBorders/>
+            <w:vAlign w:val="center"/>
+          </w:tcPr>
+          <w:p>
+            <w:pPr>
+              <w:pStyle w:val="TableContents"/>
+              <w:rPr/>
+            </w:pPr>
+            <w:r>
+              <w:rPr/>
+              <w:t>0</w:t>
+            </w:r>
+          </w:p>
+        </w:tc>
+        <w:tc>
+          <w:tcPr>
+            <w:tcW w:w="7511" w:type="dxa"/>
+            <w:tcBorders/>
+            <w:vAlign w:val="center"/>
+          </w:tcPr>
+          <w:p>
+            <w:pPr>
+              <w:pStyle w:val="TableContents"/>
+              <w:ind w:hanging="0" w:start="0" w:end="0"/>
+              <w:rPr/>
+            </w:pPr>
+            <w:r>
+              <w:rPr/>
+              <w:t>"xwdGgKnl2B7HN3q8jBGvBG6vnx7EB5jnz+AwHLKZEHs="</w:t>
+            </w:r>
+            <w:bookmarkStart w:id="6" w:name="%2Froot_token"/>
+            <w:bookmarkEnd w:id="6"/>
+          </w:p>
+        </w:tc>
+      </w:tr>
+      <w:tr>
+        <w:trPr/>
+        <w:tc>
+          <w:tcPr>
+            <w:tcW w:w="1261" w:type="dxa"/>
+            <w:tcBorders/>
+            <w:vAlign w:val="center"/>
+          </w:tcPr>
+          <w:p>
+            <w:pPr>
+              <w:pStyle w:val="TableContents"/>
+              <w:rPr/>
+            </w:pPr>
+            <w:r>
+              <w:rPr/>
+              <w:t>root_token</w:t>
+            </w:r>
+          </w:p>
+        </w:tc>
+        <w:tc>
+          <w:tcPr>
+            <w:tcW w:w="7511" w:type="dxa"/>
+            <w:tcBorders/>
+            <w:vAlign w:val="center"/>
+          </w:tcPr>
+          <w:p>
+            <w:pPr>
+              <w:pStyle w:val="TableContents"/>
+              <w:rPr/>
+            </w:pPr>
+            <w:r>
+              <w:rPr/>
+              <w:t>"hvs.sC4S3UWlDmpwlzHw62DRoSNA"</w:t>
+            </w:r>
+          </w:p>
+        </w:tc>
+      </w:tr>
+    </w:tbl>
+    <w:p>
+      <w:pPr>
+        <w:pStyle w:val="BodyText"/>
+        <w:spacing w:before="0" w:after="0"/>
+        <w:rPr/>
+      </w:pPr>
+      <w:r>
+        <w:rPr/>
+      </w:r>
+    </w:p>
+    <w:p>
+      <w:pPr>
+        <w:sectPr>
+          <w:type w:val="continuous"/>
+          <w:pgSz w:w="11906" w:h="16838"/>
+          <w:pgMar w:left="1134" w:right="1134" w:gutter="0" w:header="0" w:top="1134" w:footer="0" w:bottom="1134"/>
+          <w:formProt w:val="false"/>
+          <w:textDirection w:val="lrTb"/>
+          <w:docGrid w:type="default" w:linePitch="100" w:charSpace="0"/>
+        </w:sectPr>
+      </w:pPr>
     </w:p>
     <w:p>
       <w:pPr>
@@ -633,7 +997,7 @@
       </w:r>
     </w:p>
     <w:sectPr>
-      <w:type w:val="nextPage"/>
+      <w:type w:val="continuous"/>
       <w:pgSz w:w="11906" w:h="16838"/>
       <w:pgMar w:left="1134" w:right="1134" w:gutter="0" w:header="0" w:top="1134" w:footer="0" w:bottom="1134"/>
       <w:pgNumType w:fmt="decimal"/>
@@ -949,8 +1313,8 @@
       <w:lang w:val="en-US" w:eastAsia="zh-CN" w:bidi="hi-IN"/>
     </w:rPr>
   </w:style>
-  <w:style w:type="character" w:styleId="Bullets">
-    <w:name w:val="Bullets"/>
+  <w:style w:type="character" w:styleId="Bulletsuser">
+    <w:name w:val="Bullets (user)"/>
     <w:qFormat/>
     <w:rPr>
       <w:rFonts w:ascii="OpenSymbol" w:hAnsi="OpenSymbol" w:eastAsia="OpenSymbol" w:cs="OpenSymbol"/>
@@ -1025,6 +1389,29 @@
       <w:rFonts w:ascii="Liberation Mono" w:hAnsi="Liberation Mono" w:eastAsia="Noto Sans Mono CJK SC" w:cs="Liberation Mono"/>
       <w:sz w:val="20"/>
       <w:szCs w:val="20"/>
+    </w:rPr>
+  </w:style>
+  <w:style w:type="paragraph" w:styleId="TableContents">
+    <w:name w:val="Table Contents"/>
+    <w:basedOn w:val="Normal"/>
+    <w:qFormat/>
+    <w:pPr>
+      <w:widowControl w:val="false"/>
+      <w:suppressLineNumbers/>
+    </w:pPr>
+    <w:rPr/>
+  </w:style>
+  <w:style w:type="paragraph" w:styleId="TableHeading">
+    <w:name w:val="Table Heading"/>
+    <w:basedOn w:val="TableContents"/>
+    <w:qFormat/>
+    <w:pPr>
+      <w:suppressLineNumbers/>
+      <w:jc w:val="center"/>
+    </w:pPr>
+    <w:rPr>
+      <w:b/>
+      <w:bCs/>
     </w:rPr>
   </w:style>
 </w:styles>

</xml_diff>

<commit_message>
feat: update vault configuration and project run manual documents
</commit_message>
<xml_diff>
--- a/vault-configuration.docx
+++ b/vault-configuration.docx
@@ -100,31 +100,7 @@
         </w:rPr>
         <w:t>docker compose -f docker-compose-vault.yml exec vault \</w:t>
         <w:br/>
-        <w:t xml:space="preserve">  vault operator init -key-shares=</w:t>
-      </w:r>
-      <w:r>
-        <w:rPr>
-          <w:b/>
-          <w:bCs/>
-          <w:color w:val="C9211E"/>
-        </w:rPr>
-        <w:t>1</w:t>
-      </w:r>
-      <w:r>
-        <w:rPr>
-          <w:b/>
-          <w:bCs/>
-          <w:color w:val="C9211E"/>
-        </w:rPr>
-        <w:t xml:space="preserve"> -key-threshold=</w:t>
-      </w:r>
-      <w:r>
-        <w:rPr>
-          <w:b/>
-          <w:bCs/>
-          <w:color w:val="C9211E"/>
-        </w:rPr>
-        <w:t>1</w:t>
+        <w:t xml:space="preserve">  vault operator init -key-shares=1 -key-threshold=1</w:t>
       </w:r>
     </w:p>
     <w:p>
@@ -216,8 +192,8 @@
                 <w:szCs w:val="4"/>
               </w:rPr>
             </w:r>
-            <w:bookmarkStart w:id="0" w:name="value"/>
-            <w:bookmarkStart w:id="1" w:name="default"/>
+            <w:bookmarkStart w:id="0" w:name="default"/>
+            <w:bookmarkStart w:id="1" w:name="value"/>
             <w:bookmarkEnd w:id="0"/>
             <w:bookmarkEnd w:id="1"/>
           </w:p>
@@ -243,7 +219,7 @@
                 <w:szCs w:val="4"/>
               </w:rPr>
             </w:r>
-            <w:bookmarkStart w:id="2" w:name="%2Fkeys"/>
+            <w:bookmarkStart w:id="2" w:name="%252Fkeys"/>
             <w:bookmarkEnd w:id="2"/>
           </w:p>
         </w:tc>
@@ -288,7 +264,7 @@
                 <w:szCs w:val="4"/>
               </w:rPr>
             </w:r>
-            <w:bookmarkStart w:id="3" w:name="%2Fkeys%2F0"/>
+            <w:bookmarkStart w:id="3" w:name="%252Fkeys%252F0"/>
             <w:bookmarkEnd w:id="3"/>
           </w:p>
         </w:tc>
@@ -328,7 +304,7 @@
               <w:rPr/>
               <w:t>"c7074680a9e5d81ec7377abc8c11af046eaf9f1ec40798e7cfe0301cb299107b"</w:t>
             </w:r>
-            <w:bookmarkStart w:id="4" w:name="%2Fkeys_base64"/>
+            <w:bookmarkStart w:id="4" w:name="%252Fkeys_base64"/>
             <w:bookmarkEnd w:id="4"/>
           </w:p>
         </w:tc>
@@ -373,13 +349,15 @@
                 <w:szCs w:val="4"/>
               </w:rPr>
             </w:r>
-            <w:bookmarkStart w:id="5" w:name="%2Fkeys_base64%2F0"/>
+            <w:bookmarkStart w:id="5" w:name="%252Fkeys_base64%252F0"/>
             <w:bookmarkEnd w:id="5"/>
           </w:p>
         </w:tc>
       </w:tr>
       <w:tr>
-        <w:trPr/>
+        <w:trPr>
+          <w:trHeight w:val="476" w:hRule="atLeast"/>
+        </w:trPr>
         <w:tc>
           <w:tcPr>
             <w:tcW w:w="1261" w:type="dxa"/>
@@ -413,7 +391,7 @@
               <w:rPr/>
               <w:t>"xwdGgKnl2B7HN3q8jBGvBG6vnx7EB5jnz+AwHLKZEHs="</w:t>
             </w:r>
-            <w:bookmarkStart w:id="6" w:name="%2Froot_token"/>
+            <w:bookmarkStart w:id="6" w:name="%252Froot_token"/>
             <w:bookmarkEnd w:id="6"/>
           </w:p>
         </w:tc>
@@ -502,13 +480,10 @@
     </w:p>
     <w:p>
       <w:pPr>
-        <w:pStyle w:val="Normal"/>
-        <w:bidi w:val="0"/>
-        <w:jc w:val="start"/>
-        <w:rPr/>
-      </w:pPr>
-      <w:r>
-        <w:rPr/>
+        <w:pStyle w:val="BodyText"/>
+        <w:rPr/>
+      </w:pPr>
+      <w:r>
         <w:drawing>
           <wp:anchor distT="0" distB="0" distL="0" distR="0" simplePos="0" relativeHeight="3" behindDoc="0" locked="0" layoutInCell="0" allowOverlap="1">
             <wp:simplePos x="0" y="0"/>
@@ -556,6 +531,316 @@
           </wp:anchor>
         </w:drawing>
       </w:r>
+      <w:r>
+        <w:rPr>
+          <w:rFonts w:ascii="ui-monospace;Menlo;Consolas;monospace" w:hAnsi="ui-monospace;Menlo;Consolas;monospace"/>
+          <w:b w:val="false"/>
+          <w:i w:val="false"/>
+          <w:caps w:val="false"/>
+          <w:smallCaps w:val="false"/>
+          <w:color w:val="2D8EFF"/>
+          <w:spacing w:val="0"/>
+          <w:sz w:val="20"/>
+        </w:rPr>
+        <w:t>DB_NAME</w:t>
+      </w:r>
+      <w:r>
+        <w:rPr>
+          <w:rFonts w:ascii="ui-monospace;Menlo;Consolas;monospace" w:hAnsi="ui-monospace;Menlo;Consolas;monospace"/>
+          <w:b w:val="false"/>
+          <w:i w:val="false"/>
+          <w:caps w:val="false"/>
+          <w:smallCaps w:val="false"/>
+          <w:color w:val="D5D7DB"/>
+          <w:spacing w:val="0"/>
+          <w:sz w:val="20"/>
+        </w:rPr>
+        <w:t>:</w:t>
+      </w:r>
+      <w:r>
+        <w:rPr>
+          <w:caps w:val="false"/>
+          <w:smallCaps w:val="false"/>
+          <w:color w:val="D5D7DB"/>
+          <w:spacing w:val="0"/>
+        </w:rPr>
+        <w:t xml:space="preserve"> </w:t>
+      </w:r>
+      <w:r>
+        <w:rPr>
+          <w:rFonts w:ascii="ui-monospace;Menlo;Consolas;monospace" w:hAnsi="ui-monospace;Menlo;Consolas;monospace"/>
+          <w:b w:val="false"/>
+          <w:i w:val="false"/>
+          <w:caps w:val="false"/>
+          <w:smallCaps w:val="false"/>
+          <w:color w:val="D5D7DB"/>
+          <w:spacing w:val="0"/>
+          <w:sz w:val="20"/>
+        </w:rPr>
+        <w:t>listek</w:t>
+      </w:r>
+    </w:p>
+    <w:p>
+      <w:pPr>
+        <w:pStyle w:val="BodyText"/>
+        <w:rPr/>
+      </w:pPr>
+      <w:r>
+        <w:rPr>
+          <w:rFonts w:ascii="ui-monospace;Menlo;Consolas;monospace" w:hAnsi="ui-monospace;Menlo;Consolas;monospace"/>
+          <w:b w:val="false"/>
+          <w:i w:val="false"/>
+          <w:caps w:val="false"/>
+          <w:smallCaps w:val="false"/>
+          <w:color w:val="2D8EFF"/>
+          <w:spacing w:val="0"/>
+          <w:sz w:val="20"/>
+        </w:rPr>
+        <w:t>DB_PASSWORD</w:t>
+      </w:r>
+      <w:r>
+        <w:rPr>
+          <w:rFonts w:ascii="ui-monospace;Menlo;Consolas;monospace" w:hAnsi="ui-monospace;Menlo;Consolas;monospace"/>
+          <w:b w:val="false"/>
+          <w:i w:val="false"/>
+          <w:caps w:val="false"/>
+          <w:smallCaps w:val="false"/>
+          <w:color w:val="D5D7DB"/>
+          <w:spacing w:val="0"/>
+          <w:sz w:val="20"/>
+        </w:rPr>
+        <w:t>:</w:t>
+      </w:r>
+      <w:r>
+        <w:rPr>
+          <w:caps w:val="false"/>
+          <w:smallCaps w:val="false"/>
+          <w:color w:val="D5D7DB"/>
+          <w:spacing w:val="0"/>
+        </w:rPr>
+        <w:t xml:space="preserve"> </w:t>
+      </w:r>
+      <w:r>
+        <w:rPr>
+          <w:rFonts w:ascii="ui-monospace;Menlo;Consolas;monospace" w:hAnsi="ui-monospace;Menlo;Consolas;monospace"/>
+          <w:b w:val="false"/>
+          <w:i w:val="false"/>
+          <w:caps w:val="false"/>
+          <w:smallCaps w:val="false"/>
+          <w:color w:val="D5D7DB"/>
+          <w:spacing w:val="0"/>
+          <w:sz w:val="20"/>
+        </w:rPr>
+        <w:t>password</w:t>
+      </w:r>
+    </w:p>
+    <w:p>
+      <w:pPr>
+        <w:pStyle w:val="BodyText"/>
+        <w:rPr/>
+      </w:pPr>
+      <w:r>
+        <w:rPr>
+          <w:rFonts w:ascii="ui-monospace;Menlo;Consolas;monospace" w:hAnsi="ui-monospace;Menlo;Consolas;monospace"/>
+          <w:b w:val="false"/>
+          <w:i w:val="false"/>
+          <w:caps w:val="false"/>
+          <w:smallCaps w:val="false"/>
+          <w:color w:val="2D8EFF"/>
+          <w:spacing w:val="0"/>
+          <w:sz w:val="20"/>
+        </w:rPr>
+        <w:t>DB_URL</w:t>
+      </w:r>
+      <w:r>
+        <w:rPr>
+          <w:rFonts w:ascii="ui-monospace;Menlo;Consolas;monospace" w:hAnsi="ui-monospace;Menlo;Consolas;monospace"/>
+          <w:b w:val="false"/>
+          <w:i w:val="false"/>
+          <w:caps w:val="false"/>
+          <w:smallCaps w:val="false"/>
+          <w:color w:val="D5D7DB"/>
+          <w:spacing w:val="0"/>
+          <w:sz w:val="20"/>
+        </w:rPr>
+        <w:t>:</w:t>
+      </w:r>
+      <w:r>
+        <w:rPr>
+          <w:caps w:val="false"/>
+          <w:smallCaps w:val="false"/>
+          <w:color w:val="D5D7DB"/>
+          <w:spacing w:val="0"/>
+        </w:rPr>
+        <w:t xml:space="preserve"> </w:t>
+      </w:r>
+      <w:r>
+        <w:rPr>
+          <w:rFonts w:ascii="ui-monospace;Menlo;Consolas;monospace" w:hAnsi="ui-monospace;Menlo;Consolas;monospace"/>
+          <w:b w:val="false"/>
+          <w:i w:val="false"/>
+          <w:caps w:val="false"/>
+          <w:smallCaps w:val="false"/>
+          <w:color w:val="D5D7DB"/>
+          <w:spacing w:val="0"/>
+          <w:sz w:val="20"/>
+        </w:rPr>
+        <w:t>jdbc:postgresql://postgres:5432/listek</w:t>
+      </w:r>
+    </w:p>
+    <w:p>
+      <w:pPr>
+        <w:pStyle w:val="BodyText"/>
+        <w:rPr/>
+      </w:pPr>
+      <w:r>
+        <w:rPr>
+          <w:rFonts w:ascii="ui-monospace;Menlo;Consolas;monospace" w:hAnsi="ui-monospace;Menlo;Consolas;monospace"/>
+          <w:b w:val="false"/>
+          <w:i w:val="false"/>
+          <w:caps w:val="false"/>
+          <w:smallCaps w:val="false"/>
+          <w:color w:val="2D8EFF"/>
+          <w:spacing w:val="0"/>
+          <w:sz w:val="20"/>
+        </w:rPr>
+        <w:t>DB_USERNAME</w:t>
+      </w:r>
+      <w:r>
+        <w:rPr>
+          <w:rFonts w:ascii="ui-monospace;Menlo;Consolas;monospace" w:hAnsi="ui-monospace;Menlo;Consolas;monospace"/>
+          <w:b w:val="false"/>
+          <w:i w:val="false"/>
+          <w:caps w:val="false"/>
+          <w:smallCaps w:val="false"/>
+          <w:color w:val="D5D7DB"/>
+          <w:spacing w:val="0"/>
+          <w:sz w:val="20"/>
+        </w:rPr>
+        <w:t>:</w:t>
+      </w:r>
+      <w:r>
+        <w:rPr>
+          <w:caps w:val="false"/>
+          <w:smallCaps w:val="false"/>
+          <w:color w:val="D5D7DB"/>
+          <w:spacing w:val="0"/>
+        </w:rPr>
+        <w:t xml:space="preserve"> </w:t>
+      </w:r>
+      <w:r>
+        <w:rPr>
+          <w:rFonts w:ascii="ui-monospace;Menlo;Consolas;monospace" w:hAnsi="ui-monospace;Menlo;Consolas;monospace"/>
+          <w:b w:val="false"/>
+          <w:i w:val="false"/>
+          <w:caps w:val="false"/>
+          <w:smallCaps w:val="false"/>
+          <w:color w:val="D5D7DB"/>
+          <w:spacing w:val="0"/>
+          <w:sz w:val="20"/>
+        </w:rPr>
+        <w:t>postgres</w:t>
+      </w:r>
+    </w:p>
+    <w:p>
+      <w:pPr>
+        <w:pStyle w:val="BodyText"/>
+        <w:rPr>
+          <w:rFonts w:ascii="ui-monospace;Menlo;Consolas;monospace" w:hAnsi="ui-monospace;Menlo;Consolas;monospace"/>
+          <w:b w:val="false"/>
+          <w:i w:val="false"/>
+          <w:caps w:val="false"/>
+          <w:smallCaps w:val="false"/>
+          <w:color w:val="D5D7DB"/>
+          <w:spacing w:val="0"/>
+          <w:sz w:val="20"/>
+        </w:rPr>
+      </w:pPr>
+      <w:r>
+        <w:rPr>
+          <w:rFonts w:ascii="ui-monospace;Menlo;Consolas;monospace" w:hAnsi="ui-monospace;Menlo;Consolas;monospace"/>
+          <w:b w:val="false"/>
+          <w:i w:val="false"/>
+          <w:caps w:val="false"/>
+          <w:smallCaps w:val="false"/>
+          <w:color w:val="D5D7DB"/>
+          <w:spacing w:val="0"/>
+          <w:sz w:val="20"/>
+        </w:rPr>
+        <w:drawing>
+          <wp:anchor distT="0" distB="0" distL="0" distR="0" simplePos="0" relativeHeight="4" behindDoc="0" locked="0" layoutInCell="0" allowOverlap="1">
+            <wp:simplePos x="0" y="0"/>
+            <wp:positionH relativeFrom="column">
+              <wp:posOffset>243840</wp:posOffset>
+            </wp:positionH>
+            <wp:positionV relativeFrom="paragraph">
+              <wp:posOffset>63500</wp:posOffset>
+            </wp:positionV>
+            <wp:extent cx="6120130" cy="3824605"/>
+            <wp:effectExtent l="0" t="0" r="0" b="0"/>
+            <wp:wrapSquare wrapText="largest"/>
+            <wp:docPr id="3" name="Image3"/>
+            <wp:cNvGraphicFramePr>
+              <a:graphicFrameLocks xmlns:a="http://schemas.openxmlformats.org/drawingml/2006/main" noChangeAspect="1"/>
+            </wp:cNvGraphicFramePr>
+            <a:graphic xmlns:a="http://schemas.openxmlformats.org/drawingml/2006/main">
+              <a:graphicData uri="http://schemas.openxmlformats.org/drawingml/2006/picture">
+                <pic:pic xmlns:pic="http://schemas.openxmlformats.org/drawingml/2006/picture">
+                  <pic:nvPicPr>
+                    <pic:cNvPr id="3" name="Image3"/>
+                    <pic:cNvPicPr>
+                      <a:picLocks noChangeAspect="1" noChangeArrowheads="1"/>
+                    </pic:cNvPicPr>
+                  </pic:nvPicPr>
+                  <pic:blipFill>
+                    <a:blip r:embed="rId4"/>
+                    <a:stretch>
+                      <a:fillRect/>
+                    </a:stretch>
+                  </pic:blipFill>
+                  <pic:spPr bwMode="auto">
+                    <a:xfrm>
+                      <a:off x="0" y="0"/>
+                      <a:ext cx="6120130" cy="3824605"/>
+                    </a:xfrm>
+                    <a:prstGeom prst="rect">
+                      <a:avLst/>
+                    </a:prstGeom>
+                    <a:noFill/>
+                  </pic:spPr>
+                </pic:pic>
+              </a:graphicData>
+            </a:graphic>
+          </wp:anchor>
+        </w:drawing>
+      </w:r>
+    </w:p>
+    <w:p>
+      <w:pPr>
+        <w:pStyle w:val="BodyText"/>
+        <w:rPr>
+          <w:rFonts w:ascii="ui-monospace;Menlo;Consolas;monospace" w:hAnsi="ui-monospace;Menlo;Consolas;monospace"/>
+          <w:b w:val="false"/>
+          <w:i w:val="false"/>
+          <w:caps w:val="false"/>
+          <w:smallCaps w:val="false"/>
+          <w:color w:val="D5D7DB"/>
+          <w:spacing w:val="0"/>
+          <w:sz w:val="20"/>
+        </w:rPr>
+      </w:pPr>
+      <w:r>
+        <w:rPr>
+          <w:rFonts w:ascii="ui-monospace;Menlo;Consolas;monospace" w:hAnsi="ui-monospace;Menlo;Consolas;monospace"/>
+          <w:b w:val="false"/>
+          <w:i w:val="false"/>
+          <w:caps w:val="false"/>
+          <w:smallCaps w:val="false"/>
+          <w:color w:val="D5D7DB"/>
+          <w:spacing w:val="0"/>
+          <w:sz w:val="20"/>
+        </w:rPr>
+      </w:r>
     </w:p>
     <w:p>
       <w:pPr>
@@ -595,7 +880,7 @@
         <w:pStyle w:val="BodyText"/>
         <w:numPr>
           <w:ilvl w:val="0"/>
-          <w:numId w:val="1"/>
+          <w:numId w:val="2"/>
         </w:numPr>
         <w:tabs>
           <w:tab w:val="clear" w:pos="709"/>
@@ -616,7 +901,7 @@
         <w:pStyle w:val="BodyText"/>
         <w:numPr>
           <w:ilvl w:val="0"/>
-          <w:numId w:val="1"/>
+          <w:numId w:val="2"/>
         </w:numPr>
         <w:tabs>
           <w:tab w:val="clear" w:pos="709"/>
@@ -637,7 +922,7 @@
         <w:pStyle w:val="BodyText"/>
         <w:numPr>
           <w:ilvl w:val="0"/>
-          <w:numId w:val="1"/>
+          <w:numId w:val="2"/>
         </w:numPr>
         <w:tabs>
           <w:tab w:val="clear" w:pos="709"/>
@@ -713,6 +998,13 @@
         <w:t>cd /home/jan/Desktop/datatables/listek-backend</w:t>
         <w:br/>
         <w:br/>
+      </w:r>
+      <w:r>
+        <w:rPr>
+          <w:b/>
+          <w:bCs/>
+          <w:color w:val="C9211E"/>
+        </w:rPr>
         <w:t>docker exec -it vault vault operator unseal</w:t>
       </w:r>
     </w:p>
@@ -1000,7 +1292,6 @@
       <w:type w:val="continuous"/>
       <w:pgSz w:w="11906" w:h="16838"/>
       <w:pgMar w:left="1134" w:right="1134" w:gutter="0" w:header="0" w:top="1134" w:footer="0" w:bottom="1134"/>
-      <w:pgNumType w:fmt="decimal"/>
       <w:formProt w:val="false"/>
       <w:textDirection w:val="lrTb"/>
       <w:docGrid w:type="default" w:linePitch="100" w:charSpace="0"/>
@@ -1014,6 +1305,125 @@
   <w:abstractNum w:abstractNumId="1">
     <w:lvl w:ilvl="0">
       <w:start w:val="1"/>
+      <w:numFmt w:val="none"/>
+      <w:suff w:val="nothing"/>
+      <w:lvlText w:val=""/>
+      <w:lvlJc w:val="start"/>
+      <w:pPr>
+        <w:tabs>
+          <w:tab w:val="num" w:pos="0"/>
+        </w:tabs>
+        <w:ind w:start="0" w:hanging="0"/>
+      </w:pPr>
+    </w:lvl>
+    <w:lvl w:ilvl="1">
+      <w:start w:val="1"/>
+      <w:numFmt w:val="none"/>
+      <w:suff w:val="nothing"/>
+      <w:lvlText w:val=""/>
+      <w:lvlJc w:val="start"/>
+      <w:pPr>
+        <w:tabs>
+          <w:tab w:val="num" w:pos="0"/>
+        </w:tabs>
+        <w:ind w:start="0" w:hanging="0"/>
+      </w:pPr>
+    </w:lvl>
+    <w:lvl w:ilvl="2">
+      <w:start w:val="1"/>
+      <w:numFmt w:val="none"/>
+      <w:suff w:val="nothing"/>
+      <w:lvlText w:val=""/>
+      <w:lvlJc w:val="start"/>
+      <w:pPr>
+        <w:tabs>
+          <w:tab w:val="num" w:pos="0"/>
+        </w:tabs>
+        <w:ind w:start="0" w:hanging="0"/>
+      </w:pPr>
+    </w:lvl>
+    <w:lvl w:ilvl="3">
+      <w:start w:val="1"/>
+      <w:numFmt w:val="none"/>
+      <w:suff w:val="nothing"/>
+      <w:lvlText w:val=""/>
+      <w:lvlJc w:val="start"/>
+      <w:pPr>
+        <w:tabs>
+          <w:tab w:val="num" w:pos="0"/>
+        </w:tabs>
+        <w:ind w:start="0" w:hanging="0"/>
+      </w:pPr>
+    </w:lvl>
+    <w:lvl w:ilvl="4">
+      <w:start w:val="1"/>
+      <w:numFmt w:val="none"/>
+      <w:suff w:val="nothing"/>
+      <w:lvlText w:val=""/>
+      <w:lvlJc w:val="start"/>
+      <w:pPr>
+        <w:tabs>
+          <w:tab w:val="num" w:pos="0"/>
+        </w:tabs>
+        <w:ind w:start="0" w:hanging="0"/>
+      </w:pPr>
+    </w:lvl>
+    <w:lvl w:ilvl="5">
+      <w:start w:val="1"/>
+      <w:numFmt w:val="none"/>
+      <w:suff w:val="nothing"/>
+      <w:lvlText w:val=""/>
+      <w:lvlJc w:val="start"/>
+      <w:pPr>
+        <w:tabs>
+          <w:tab w:val="num" w:pos="0"/>
+        </w:tabs>
+        <w:ind w:start="0" w:hanging="0"/>
+      </w:pPr>
+    </w:lvl>
+    <w:lvl w:ilvl="6">
+      <w:start w:val="1"/>
+      <w:numFmt w:val="none"/>
+      <w:suff w:val="nothing"/>
+      <w:lvlText w:val=""/>
+      <w:lvlJc w:val="start"/>
+      <w:pPr>
+        <w:tabs>
+          <w:tab w:val="num" w:pos="0"/>
+        </w:tabs>
+        <w:ind w:start="0" w:hanging="0"/>
+      </w:pPr>
+    </w:lvl>
+    <w:lvl w:ilvl="7">
+      <w:start w:val="1"/>
+      <w:numFmt w:val="none"/>
+      <w:suff w:val="nothing"/>
+      <w:lvlText w:val=""/>
+      <w:lvlJc w:val="start"/>
+      <w:pPr>
+        <w:tabs>
+          <w:tab w:val="num" w:pos="0"/>
+        </w:tabs>
+        <w:ind w:start="0" w:hanging="0"/>
+      </w:pPr>
+    </w:lvl>
+    <w:lvl w:ilvl="8">
+      <w:start w:val="1"/>
+      <w:numFmt w:val="none"/>
+      <w:suff w:val="nothing"/>
+      <w:lvlText w:val=""/>
+      <w:lvlJc w:val="start"/>
+      <w:pPr>
+        <w:tabs>
+          <w:tab w:val="num" w:pos="0"/>
+        </w:tabs>
+        <w:ind w:start="0" w:hanging="0"/>
+      </w:pPr>
+    </w:lvl>
+  </w:abstractNum>
+  <w:abstractNum w:abstractNumId="2">
+    <w:lvl w:ilvl="0">
+      <w:start w:val="1"/>
       <w:numFmt w:val="bullet"/>
       <w:lvlText w:val=""/>
       <w:lvlJc w:val="start"/>
@@ -1146,125 +1556,6 @@
       <w:rPr>
         <w:rFonts w:ascii="Symbol" w:hAnsi="Symbol" w:cs="Symbol" w:hint="default"/>
       </w:rPr>
-    </w:lvl>
-  </w:abstractNum>
-  <w:abstractNum w:abstractNumId="2">
-    <w:lvl w:ilvl="0">
-      <w:start w:val="1"/>
-      <w:numFmt w:val="none"/>
-      <w:suff w:val="nothing"/>
-      <w:lvlText w:val=""/>
-      <w:lvlJc w:val="start"/>
-      <w:pPr>
-        <w:tabs>
-          <w:tab w:val="num" w:pos="0"/>
-        </w:tabs>
-        <w:ind w:start="0" w:hanging="0"/>
-      </w:pPr>
-    </w:lvl>
-    <w:lvl w:ilvl="1">
-      <w:start w:val="1"/>
-      <w:numFmt w:val="none"/>
-      <w:suff w:val="nothing"/>
-      <w:lvlText w:val=""/>
-      <w:lvlJc w:val="start"/>
-      <w:pPr>
-        <w:tabs>
-          <w:tab w:val="num" w:pos="0"/>
-        </w:tabs>
-        <w:ind w:start="0" w:hanging="0"/>
-      </w:pPr>
-    </w:lvl>
-    <w:lvl w:ilvl="2">
-      <w:start w:val="1"/>
-      <w:numFmt w:val="none"/>
-      <w:suff w:val="nothing"/>
-      <w:lvlText w:val=""/>
-      <w:lvlJc w:val="start"/>
-      <w:pPr>
-        <w:tabs>
-          <w:tab w:val="num" w:pos="0"/>
-        </w:tabs>
-        <w:ind w:start="0" w:hanging="0"/>
-      </w:pPr>
-    </w:lvl>
-    <w:lvl w:ilvl="3">
-      <w:start w:val="1"/>
-      <w:numFmt w:val="none"/>
-      <w:suff w:val="nothing"/>
-      <w:lvlText w:val=""/>
-      <w:lvlJc w:val="start"/>
-      <w:pPr>
-        <w:tabs>
-          <w:tab w:val="num" w:pos="0"/>
-        </w:tabs>
-        <w:ind w:start="0" w:hanging="0"/>
-      </w:pPr>
-    </w:lvl>
-    <w:lvl w:ilvl="4">
-      <w:start w:val="1"/>
-      <w:numFmt w:val="none"/>
-      <w:suff w:val="nothing"/>
-      <w:lvlText w:val=""/>
-      <w:lvlJc w:val="start"/>
-      <w:pPr>
-        <w:tabs>
-          <w:tab w:val="num" w:pos="0"/>
-        </w:tabs>
-        <w:ind w:start="0" w:hanging="0"/>
-      </w:pPr>
-    </w:lvl>
-    <w:lvl w:ilvl="5">
-      <w:start w:val="1"/>
-      <w:numFmt w:val="none"/>
-      <w:suff w:val="nothing"/>
-      <w:lvlText w:val=""/>
-      <w:lvlJc w:val="start"/>
-      <w:pPr>
-        <w:tabs>
-          <w:tab w:val="num" w:pos="0"/>
-        </w:tabs>
-        <w:ind w:start="0" w:hanging="0"/>
-      </w:pPr>
-    </w:lvl>
-    <w:lvl w:ilvl="6">
-      <w:start w:val="1"/>
-      <w:numFmt w:val="none"/>
-      <w:suff w:val="nothing"/>
-      <w:lvlText w:val=""/>
-      <w:lvlJc w:val="start"/>
-      <w:pPr>
-        <w:tabs>
-          <w:tab w:val="num" w:pos="0"/>
-        </w:tabs>
-        <w:ind w:start="0" w:hanging="0"/>
-      </w:pPr>
-    </w:lvl>
-    <w:lvl w:ilvl="7">
-      <w:start w:val="1"/>
-      <w:numFmt w:val="none"/>
-      <w:suff w:val="nothing"/>
-      <w:lvlText w:val=""/>
-      <w:lvlJc w:val="start"/>
-      <w:pPr>
-        <w:tabs>
-          <w:tab w:val="num" w:pos="0"/>
-        </w:tabs>
-        <w:ind w:start="0" w:hanging="0"/>
-      </w:pPr>
-    </w:lvl>
-    <w:lvl w:ilvl="8">
-      <w:start w:val="1"/>
-      <w:numFmt w:val="none"/>
-      <w:suff w:val="nothing"/>
-      <w:lvlText w:val=""/>
-      <w:lvlJc w:val="start"/>
-      <w:pPr>
-        <w:tabs>
-          <w:tab w:val="num" w:pos="0"/>
-        </w:tabs>
-        <w:ind w:start="0" w:hanging="0"/>
-      </w:pPr>
     </w:lvl>
   </w:abstractNum>
   <w:num w:numId="1">
@@ -1313,8 +1604,8 @@
       <w:lang w:val="en-US" w:eastAsia="zh-CN" w:bidi="hi-IN"/>
     </w:rPr>
   </w:style>
-  <w:style w:type="character" w:styleId="Bulletsuser">
-    <w:name w:val="Bullets (user)"/>
+  <w:style w:type="character" w:styleId="Bullets">
+    <w:name w:val="Bullets"/>
     <w:qFormat/>
     <w:rPr>
       <w:rFonts w:ascii="OpenSymbol" w:hAnsi="OpenSymbol" w:eastAsia="OpenSymbol" w:cs="OpenSymbol"/>

</xml_diff>